<commit_message>
feat - organization files
</commit_message>
<xml_diff>
--- a/DOSW-ParcialT1/docs/requirements/Plantilla_Requerimientos_DOSW (1).docx
+++ b/DOSW-ParcialT1/docs/requirements/Plantilla_Requerimientos_DOSW (1).docx
@@ -105,27 +105,7 @@
                 <w:szCs w:val="13"/>
                 <w:lang w:val="en-US"/>
               </w:rPr>
-              <w:t xml:space="preserve">Desarrollo y </w:t>
-            </w:r>
-            <w:proofErr w:type="spellStart"/>
-            <w:r>
-              <w:rPr>
-                <w:color w:val="B9C9E6"/>
-                <w:sz w:val="13"/>
-                <w:szCs w:val="13"/>
-                <w:lang w:val="en-US"/>
-              </w:rPr>
-              <w:t>Operaciones</w:t>
-            </w:r>
-            <w:proofErr w:type="spellEnd"/>
-            <w:r>
-              <w:rPr>
-                <w:color w:val="B9C9E6"/>
-                <w:sz w:val="13"/>
-                <w:szCs w:val="13"/>
-                <w:lang w:val="en-US"/>
-              </w:rPr>
-              <w:t xml:space="preserve"> de Software</w:t>
+              <w:t>Desarrollo y Operaciones de Software</w:t>
             </w:r>
           </w:p>
         </w:tc>
@@ -177,7 +157,6 @@
             <w:vAlign w:val="center"/>
           </w:tcPr>
           <w:p>
-            <w:proofErr w:type="spellStart"/>
             <w:r>
               <w:rPr>
                 <w:b/>
@@ -187,19 +166,7 @@
                 <w:szCs w:val="18"/>
                 <w:lang w:val="en-US"/>
               </w:rPr>
-              <w:t>Fecha</w:t>
-            </w:r>
-            <w:proofErr w:type="spellEnd"/>
-            <w:r>
-              <w:rPr>
-                <w:b/>
-                <w:bCs/>
-                <w:color w:val="1F3864"/>
-                <w:sz w:val="18"/>
-                <w:szCs w:val="18"/>
-                <w:lang w:val="en-US"/>
-              </w:rPr>
-              <w:t>:</w:t>
+              <w:t>Fecha:</w:t>
             </w:r>
           </w:p>
         </w:tc>
@@ -540,7 +507,6 @@
             <w:vAlign w:val="center"/>
           </w:tcPr>
           <w:p>
-            <w:proofErr w:type="spellStart"/>
             <w:r>
               <w:rPr>
                 <w:b/>
@@ -550,9 +516,57 @@
                 <w:szCs w:val="20"/>
                 <w:lang w:val="en-US"/>
               </w:rPr>
-              <w:t>Descripción</w:t>
-            </w:r>
-            <w:proofErr w:type="spellEnd"/>
+              <w:t>Descripción:</w:t>
+            </w:r>
+          </w:p>
+        </w:tc>
+        <w:tc>
+          <w:tcPr>
+            <w:tcW w:w="7280" w:type="dxa"/>
+            <w:tcBorders>
+              <w:top w:val="single" w:sz="4" w:space="0" w:color="B7C2D6"/>
+              <w:left w:val="single" w:sz="4" w:space="0" w:color="B7C2D6"/>
+              <w:bottom w:val="single" w:sz="4" w:space="0" w:color="B7C2D6"/>
+              <w:right w:val="single" w:sz="4" w:space="0" w:color="B7C2D6"/>
+            </w:tcBorders>
+            <w:tcMar>
+              <w:top w:w="80" w:type="dxa"/>
+              <w:left w:w="130" w:type="dxa"/>
+              <w:bottom w:w="80" w:type="dxa"/>
+              <w:right w:w="130" w:type="dxa"/>
+            </w:tcMar>
+            <w:vAlign w:val="center"/>
+          </w:tcPr>
+          <w:p>
+            <w:r>
+              <w:t>P</w:t>
+            </w:r>
+            <w:r>
+              <w:t>ermitir al cliente construir un pedido</w:t>
+            </w:r>
+          </w:p>
+        </w:tc>
+      </w:tr>
+      <w:tr>
+        <w:tc>
+          <w:tcPr>
+            <w:tcW w:w="2800" w:type="dxa"/>
+            <w:tcBorders>
+              <w:top w:val="single" w:sz="4" w:space="0" w:color="B7C2D6"/>
+              <w:left w:val="single" w:sz="4" w:space="0" w:color="B7C2D6"/>
+              <w:bottom w:val="single" w:sz="4" w:space="0" w:color="B7C2D6"/>
+              <w:right w:val="single" w:sz="4" w:space="0" w:color="B7C2D6"/>
+            </w:tcBorders>
+            <w:shd w:val="clear" w:color="auto" w:fill="F2F4F7"/>
+            <w:tcMar>
+              <w:top w:w="80" w:type="dxa"/>
+              <w:left w:w="130" w:type="dxa"/>
+              <w:bottom w:w="80" w:type="dxa"/>
+              <w:right w:w="130" w:type="dxa"/>
+            </w:tcMar>
+            <w:vAlign w:val="center"/>
+          </w:tcPr>
+          <w:p>
             <w:r>
               <w:rPr>
                 <w:b/>
@@ -562,7 +576,7 @@
                 <w:szCs w:val="20"/>
                 <w:lang w:val="en-US"/>
               </w:rPr>
-              <w:t>:</w:t>
+              <w:t>Cómo se ejecutará:</w:t>
             </w:r>
           </w:p>
         </w:tc>
@@ -585,10 +599,7 @@
           </w:tcPr>
           <w:p>
             <w:r>
-              <w:t>P</w:t>
-            </w:r>
-            <w:r>
-              <w:t>ermitir al cliente construir un pedido</w:t>
+              <w:t>El cliente accede a la pantalla principal, selecciona productos del menú y los va añadiendo a su pedido en construcción. Una vez terminado, elige su preferencia de entrega y confirma.</w:t>
             </w:r>
           </w:p>
         </w:tc>
@@ -613,7 +624,62 @@
             <w:vAlign w:val="center"/>
           </w:tcPr>
           <w:p>
-            <w:proofErr w:type="spellStart"/>
+            <w:r>
+              <w:rPr>
+                <w:b/>
+                <w:bCs/>
+                <w:color w:val="1F3864"/>
+                <w:sz w:val="20"/>
+                <w:szCs w:val="20"/>
+              </w:rPr>
+              <w:t>Actor principal:</w:t>
+            </w:r>
+          </w:p>
+        </w:tc>
+        <w:tc>
+          <w:tcPr>
+            <w:tcW w:w="7280" w:type="dxa"/>
+            <w:tcBorders>
+              <w:top w:val="single" w:sz="4" w:space="0" w:color="B7C2D6"/>
+              <w:left w:val="single" w:sz="4" w:space="0" w:color="B7C2D6"/>
+              <w:bottom w:val="single" w:sz="4" w:space="0" w:color="B7C2D6"/>
+              <w:right w:val="single" w:sz="4" w:space="0" w:color="B7C2D6"/>
+            </w:tcBorders>
+            <w:tcMar>
+              <w:top w:w="80" w:type="dxa"/>
+              <w:left w:w="130" w:type="dxa"/>
+              <w:bottom w:w="80" w:type="dxa"/>
+              <w:right w:w="130" w:type="dxa"/>
+            </w:tcMar>
+            <w:vAlign w:val="center"/>
+          </w:tcPr>
+          <w:p>
+            <w:r>
+              <w:t>Cliente (Estudiante o Profesor)</w:t>
+            </w:r>
+          </w:p>
+        </w:tc>
+      </w:tr>
+      <w:tr>
+        <w:tc>
+          <w:tcPr>
+            <w:tcW w:w="2800" w:type="dxa"/>
+            <w:tcBorders>
+              <w:top w:val="single" w:sz="4" w:space="0" w:color="B7C2D6"/>
+              <w:left w:val="single" w:sz="4" w:space="0" w:color="B7C2D6"/>
+              <w:bottom w:val="single" w:sz="4" w:space="0" w:color="B7C2D6"/>
+              <w:right w:val="single" w:sz="4" w:space="0" w:color="B7C2D6"/>
+            </w:tcBorders>
+            <w:shd w:val="clear" w:color="auto" w:fill="F2F4F7"/>
+            <w:tcMar>
+              <w:top w:w="80" w:type="dxa"/>
+              <w:left w:w="130" w:type="dxa"/>
+              <w:bottom w:w="80" w:type="dxa"/>
+              <w:right w:w="130" w:type="dxa"/>
+            </w:tcMar>
+            <w:vAlign w:val="center"/>
+          </w:tcPr>
+          <w:p>
             <w:r>
               <w:rPr>
                 <w:b/>
@@ -623,169 +689,7 @@
                 <w:szCs w:val="20"/>
                 <w:lang w:val="en-US"/>
               </w:rPr>
-              <w:t>Cómo</w:t>
-            </w:r>
-            <w:proofErr w:type="spellEnd"/>
-            <w:r>
-              <w:rPr>
-                <w:b/>
-                <w:bCs/>
-                <w:color w:val="1F3864"/>
-                <w:sz w:val="20"/>
-                <w:szCs w:val="20"/>
-                <w:lang w:val="en-US"/>
-              </w:rPr>
-              <w:t xml:space="preserve"> se </w:t>
-            </w:r>
-            <w:proofErr w:type="spellStart"/>
-            <w:r>
-              <w:rPr>
-                <w:b/>
-                <w:bCs/>
-                <w:color w:val="1F3864"/>
-                <w:sz w:val="20"/>
-                <w:szCs w:val="20"/>
-                <w:lang w:val="en-US"/>
-              </w:rPr>
-              <w:t>ejecutará</w:t>
-            </w:r>
-            <w:proofErr w:type="spellEnd"/>
-            <w:r>
-              <w:rPr>
-                <w:b/>
-                <w:bCs/>
-                <w:color w:val="1F3864"/>
-                <w:sz w:val="20"/>
-                <w:szCs w:val="20"/>
-                <w:lang w:val="en-US"/>
-              </w:rPr>
-              <w:t>:</w:t>
-            </w:r>
-          </w:p>
-        </w:tc>
-        <w:tc>
-          <w:tcPr>
-            <w:tcW w:w="7280" w:type="dxa"/>
-            <w:tcBorders>
-              <w:top w:val="single" w:sz="4" w:space="0" w:color="B7C2D6"/>
-              <w:left w:val="single" w:sz="4" w:space="0" w:color="B7C2D6"/>
-              <w:bottom w:val="single" w:sz="4" w:space="0" w:color="B7C2D6"/>
-              <w:right w:val="single" w:sz="4" w:space="0" w:color="B7C2D6"/>
-            </w:tcBorders>
-            <w:tcMar>
-              <w:top w:w="80" w:type="dxa"/>
-              <w:left w:w="130" w:type="dxa"/>
-              <w:bottom w:w="80" w:type="dxa"/>
-              <w:right w:w="130" w:type="dxa"/>
-            </w:tcMar>
-            <w:vAlign w:val="center"/>
-          </w:tcPr>
-          <w:p>
-            <w:r>
-              <w:t>El cliente accede a la pantalla principal, selecciona productos del menú y los va añadiendo a su pedido en construcción. Una vez terminado, elige su preferencia de entrega y confirma.</w:t>
-            </w:r>
-          </w:p>
-        </w:tc>
-      </w:tr>
-      <w:tr>
-        <w:tc>
-          <w:tcPr>
-            <w:tcW w:w="2800" w:type="dxa"/>
-            <w:tcBorders>
-              <w:top w:val="single" w:sz="4" w:space="0" w:color="B7C2D6"/>
-              <w:left w:val="single" w:sz="4" w:space="0" w:color="B7C2D6"/>
-              <w:bottom w:val="single" w:sz="4" w:space="0" w:color="B7C2D6"/>
-              <w:right w:val="single" w:sz="4" w:space="0" w:color="B7C2D6"/>
-            </w:tcBorders>
-            <w:shd w:val="clear" w:color="auto" w:fill="F2F4F7"/>
-            <w:tcMar>
-              <w:top w:w="80" w:type="dxa"/>
-              <w:left w:w="130" w:type="dxa"/>
-              <w:bottom w:w="80" w:type="dxa"/>
-              <w:right w:w="130" w:type="dxa"/>
-            </w:tcMar>
-            <w:vAlign w:val="center"/>
-          </w:tcPr>
-          <w:p>
-            <w:r>
-              <w:rPr>
-                <w:b/>
-                <w:bCs/>
-                <w:color w:val="1F3864"/>
-                <w:sz w:val="20"/>
-                <w:szCs w:val="20"/>
-              </w:rPr>
-              <w:t>Actor principal:</w:t>
-            </w:r>
-          </w:p>
-        </w:tc>
-        <w:tc>
-          <w:tcPr>
-            <w:tcW w:w="7280" w:type="dxa"/>
-            <w:tcBorders>
-              <w:top w:val="single" w:sz="4" w:space="0" w:color="B7C2D6"/>
-              <w:left w:val="single" w:sz="4" w:space="0" w:color="B7C2D6"/>
-              <w:bottom w:val="single" w:sz="4" w:space="0" w:color="B7C2D6"/>
-              <w:right w:val="single" w:sz="4" w:space="0" w:color="B7C2D6"/>
-            </w:tcBorders>
-            <w:tcMar>
-              <w:top w:w="80" w:type="dxa"/>
-              <w:left w:w="130" w:type="dxa"/>
-              <w:bottom w:w="80" w:type="dxa"/>
-              <w:right w:w="130" w:type="dxa"/>
-            </w:tcMar>
-            <w:vAlign w:val="center"/>
-          </w:tcPr>
-          <w:p>
-            <w:r>
-              <w:t>Cliente (Estudiante o Profesor)</w:t>
-            </w:r>
-          </w:p>
-        </w:tc>
-      </w:tr>
-      <w:tr>
-        <w:tc>
-          <w:tcPr>
-            <w:tcW w:w="2800" w:type="dxa"/>
-            <w:tcBorders>
-              <w:top w:val="single" w:sz="4" w:space="0" w:color="B7C2D6"/>
-              <w:left w:val="single" w:sz="4" w:space="0" w:color="B7C2D6"/>
-              <w:bottom w:val="single" w:sz="4" w:space="0" w:color="B7C2D6"/>
-              <w:right w:val="single" w:sz="4" w:space="0" w:color="B7C2D6"/>
-            </w:tcBorders>
-            <w:shd w:val="clear" w:color="auto" w:fill="F2F4F7"/>
-            <w:tcMar>
-              <w:top w:w="80" w:type="dxa"/>
-              <w:left w:w="130" w:type="dxa"/>
-              <w:bottom w:w="80" w:type="dxa"/>
-              <w:right w:w="130" w:type="dxa"/>
-            </w:tcMar>
-            <w:vAlign w:val="center"/>
-          </w:tcPr>
-          <w:p>
-            <w:proofErr w:type="spellStart"/>
-            <w:r>
-              <w:rPr>
-                <w:b/>
-                <w:bCs/>
-                <w:color w:val="1F3864"/>
-                <w:sz w:val="20"/>
-                <w:szCs w:val="20"/>
-                <w:lang w:val="en-US"/>
-              </w:rPr>
-              <w:t>Precondiciones</w:t>
-            </w:r>
-            <w:proofErr w:type="spellEnd"/>
-            <w:r>
-              <w:rPr>
-                <w:b/>
-                <w:bCs/>
-                <w:color w:val="1F3864"/>
-                <w:sz w:val="20"/>
-                <w:szCs w:val="20"/>
-                <w:lang w:val="en-US"/>
-              </w:rPr>
-              <w:t>:</w:t>
+              <w:t>Precondiciones:</w:t>
             </w:r>
           </w:p>
         </w:tc>
@@ -927,7 +831,6 @@
             <w:pPr>
               <w:jc w:val="center"/>
             </w:pPr>
-            <w:proofErr w:type="spellStart"/>
             <w:r>
               <w:rPr>
                 <w:b/>
@@ -939,7 +842,6 @@
               </w:rPr>
               <w:t>Descripción</w:t>
             </w:r>
-            <w:proofErr w:type="spellEnd"/>
           </w:p>
         </w:tc>
         <w:tc>
@@ -1007,21 +909,8 @@
                 <w:szCs w:val="18"/>
                 <w:lang w:val="en-US"/>
               </w:rPr>
-              <w:t xml:space="preserve">Reglas / </w:t>
-            </w:r>
-            <w:proofErr w:type="spellStart"/>
-            <w:r>
-              <w:rPr>
-                <w:b/>
-                <w:bCs/>
-                <w:color w:val="FFFFFF"/>
-                <w:sz w:val="18"/>
-                <w:szCs w:val="18"/>
-                <w:lang w:val="en-US"/>
-              </w:rPr>
-              <w:t>Aplicación</w:t>
-            </w:r>
-            <w:proofErr w:type="spellEnd"/>
+              <w:t>Reglas / Aplicación</w:t>
+            </w:r>
           </w:p>
         </w:tc>
         <w:tc>
@@ -1046,7 +935,6 @@
             <w:pPr>
               <w:jc w:val="center"/>
             </w:pPr>
-            <w:proofErr w:type="spellStart"/>
             <w:r>
               <w:rPr>
                 <w:b/>
@@ -1058,7 +946,6 @@
               </w:rPr>
               <w:t>Obligatorio</w:t>
             </w:r>
-            <w:proofErr w:type="spellEnd"/>
           </w:p>
         </w:tc>
       </w:tr>
@@ -1150,13 +1037,8 @@
             <w:vAlign w:val="center"/>
           </w:tcPr>
           <w:p>
-            <w:proofErr w:type="spellStart"/>
-            <w:r>
-              <w:t>Maximo</w:t>
-            </w:r>
-            <w:proofErr w:type="spellEnd"/>
-            <w:r>
-              <w:t xml:space="preserve"> 5 productos diferentes</w:t>
+            <w:r>
+              <w:t>Maximo 5 productos diferentes</w:t>
             </w:r>
           </w:p>
         </w:tc>
@@ -1249,11 +1131,9 @@
             <w:vAlign w:val="center"/>
           </w:tcPr>
           <w:p>
-            <w:proofErr w:type="spellStart"/>
             <w:r>
               <w:t>Enum</w:t>
             </w:r>
-            <w:proofErr w:type="spellEnd"/>
           </w:p>
         </w:tc>
         <w:tc>
@@ -1345,13 +1225,8 @@
             <w:vAlign w:val="center"/>
           </w:tcPr>
           <w:p>
-            <w:proofErr w:type="spellStart"/>
-            <w:r>
-              <w:t>Personalizacion</w:t>
-            </w:r>
-            <w:proofErr w:type="spellEnd"/>
-            <w:r>
-              <w:t xml:space="preserve"> adicionales de cada producto</w:t>
+            <w:r>
+              <w:t>Personalizacion adicionales de cada producto</w:t>
             </w:r>
           </w:p>
         </w:tc>
@@ -1565,7 +1440,6 @@
             <w:pPr>
               <w:jc w:val="center"/>
             </w:pPr>
-            <w:proofErr w:type="spellStart"/>
             <w:r>
               <w:rPr>
                 <w:b/>
@@ -1577,7 +1451,6 @@
               </w:rPr>
               <w:t>Descripción</w:t>
             </w:r>
-            <w:proofErr w:type="spellEnd"/>
           </w:p>
         </w:tc>
         <w:tc>
@@ -1645,21 +1518,8 @@
                 <w:szCs w:val="18"/>
                 <w:lang w:val="en-US"/>
               </w:rPr>
-              <w:t xml:space="preserve">Reglas / </w:t>
-            </w:r>
-            <w:proofErr w:type="spellStart"/>
-            <w:r>
-              <w:rPr>
-                <w:b/>
-                <w:bCs/>
-                <w:color w:val="FFFFFF"/>
-                <w:sz w:val="18"/>
-                <w:szCs w:val="18"/>
-                <w:lang w:val="en-US"/>
-              </w:rPr>
-              <w:t>Aplicación</w:t>
-            </w:r>
-            <w:proofErr w:type="spellEnd"/>
+              <w:t>Reglas / Aplicación</w:t>
+            </w:r>
           </w:p>
         </w:tc>
         <w:tc>
@@ -1684,7 +1544,6 @@
             <w:pPr>
               <w:jc w:val="center"/>
             </w:pPr>
-            <w:proofErr w:type="spellStart"/>
             <w:r>
               <w:rPr>
                 <w:b/>
@@ -1696,7 +1555,6 @@
               </w:rPr>
               <w:t>Obligatorio</w:t>
             </w:r>
-            <w:proofErr w:type="spellEnd"/>
           </w:p>
         </w:tc>
       </w:tr>
@@ -2192,7 +2050,6 @@
             <w:pPr>
               <w:jc w:val="center"/>
             </w:pPr>
-            <w:proofErr w:type="spellStart"/>
             <w:r>
               <w:rPr>
                 <w:b/>
@@ -2204,7 +2061,6 @@
               </w:rPr>
               <w:t>Descripción</w:t>
             </w:r>
-            <w:proofErr w:type="spellEnd"/>
           </w:p>
         </w:tc>
         <w:tc>
@@ -2229,7 +2085,6 @@
             <w:pPr>
               <w:jc w:val="center"/>
             </w:pPr>
-            <w:proofErr w:type="spellStart"/>
             <w:r>
               <w:rPr>
                 <w:b/>
@@ -2241,7 +2096,6 @@
               </w:rPr>
               <w:t>Excepciones</w:t>
             </w:r>
-            <w:proofErr w:type="spellEnd"/>
           </w:p>
         </w:tc>
       </w:tr>
@@ -2998,7 +2852,6 @@
             <w:pPr>
               <w:jc w:val="center"/>
             </w:pPr>
-            <w:proofErr w:type="spellStart"/>
             <w:r>
               <w:rPr>
                 <w:b/>
@@ -3010,7 +2863,6 @@
               </w:rPr>
               <w:t>Descripción</w:t>
             </w:r>
-            <w:proofErr w:type="spellEnd"/>
           </w:p>
         </w:tc>
         <w:tc>
@@ -3035,7 +2887,6 @@
             <w:pPr>
               <w:jc w:val="center"/>
             </w:pPr>
-            <w:proofErr w:type="spellStart"/>
             <w:r>
               <w:rPr>
                 <w:b/>
@@ -3047,7 +2898,6 @@
               </w:rPr>
               <w:t>Excepciones</w:t>
             </w:r>
-            <w:proofErr w:type="spellEnd"/>
           </w:p>
         </w:tc>
       </w:tr>
@@ -3366,7 +3216,6 @@
             <w:vAlign w:val="center"/>
           </w:tcPr>
           <w:p>
-            <w:proofErr w:type="spellStart"/>
             <w:r>
               <w:rPr>
                 <w:b/>
@@ -3377,43 +3226,7 @@
                 <w:lang w:val="en-US"/>
               </w:rPr>
               <w:lastRenderedPageBreak/>
-              <w:t>Notas</w:t>
-            </w:r>
-            <w:proofErr w:type="spellEnd"/>
-            <w:r>
-              <w:rPr>
-                <w:b/>
-                <w:bCs/>
-                <w:color w:val="1F3864"/>
-                <w:sz w:val="20"/>
-                <w:szCs w:val="20"/>
-                <w:lang w:val="en-US"/>
-              </w:rPr>
-              <w:t xml:space="preserve"> y </w:t>
-            </w:r>
-            <w:proofErr w:type="spellStart"/>
-            <w:r>
-              <w:rPr>
-                <w:b/>
-                <w:bCs/>
-                <w:color w:val="1F3864"/>
-                <w:sz w:val="20"/>
-                <w:szCs w:val="20"/>
-                <w:lang w:val="en-US"/>
-              </w:rPr>
-              <w:t>comentarios</w:t>
-            </w:r>
-            <w:proofErr w:type="spellEnd"/>
-            <w:r>
-              <w:rPr>
-                <w:b/>
-                <w:bCs/>
-                <w:color w:val="1F3864"/>
-                <w:sz w:val="20"/>
-                <w:szCs w:val="20"/>
-                <w:lang w:val="en-US"/>
-              </w:rPr>
-              <w:t>:</w:t>
+              <w:t>Notas y comentarios:</w:t>
             </w:r>
           </w:p>
         </w:tc>
@@ -3475,7 +3288,6 @@
           <w:between w:val="nil"/>
         </w:pBdr>
       </w:pPr>
-      <w:proofErr w:type="spellStart"/>
       <w:r>
         <w:rPr>
           <w:color w:val="000000"/>
@@ -3483,7 +3295,6 @@
         </w:rPr>
         <w:t>Prototipos</w:t>
       </w:r>
-      <w:proofErr w:type="spellEnd"/>
     </w:p>
     <w:p>
       <w:pPr>
@@ -3582,7 +3393,6 @@
             <w:pPr>
               <w:jc w:val="center"/>
             </w:pPr>
-            <w:proofErr w:type="spellStart"/>
             <w:r>
               <w:rPr>
                 <w:b/>
@@ -3594,7 +3404,6 @@
               </w:rPr>
               <w:t>Descripción</w:t>
             </w:r>
-            <w:proofErr w:type="spellEnd"/>
           </w:p>
         </w:tc>
       </w:tr>
@@ -3811,7 +3620,6 @@
             <w:pPr>
               <w:jc w:val="center"/>
             </w:pPr>
-            <w:proofErr w:type="spellStart"/>
             <w:r>
               <w:rPr>
                 <w:b/>
@@ -3823,7 +3631,6 @@
               </w:rPr>
               <w:t>Abreviatura</w:t>
             </w:r>
-            <w:proofErr w:type="spellEnd"/>
           </w:p>
         </w:tc>
         <w:tc>
@@ -3848,7 +3655,6 @@
             <w:pPr>
               <w:jc w:val="center"/>
             </w:pPr>
-            <w:proofErr w:type="spellStart"/>
             <w:r>
               <w:rPr>
                 <w:b/>
@@ -3860,7 +3666,6 @@
               </w:rPr>
               <w:t>Significado</w:t>
             </w:r>
-            <w:proofErr w:type="spellEnd"/>
           </w:p>
         </w:tc>
       </w:tr>
@@ -4055,7 +3860,6 @@
             <w:pPr>
               <w:jc w:val="center"/>
             </w:pPr>
-            <w:proofErr w:type="spellStart"/>
             <w:r>
               <w:rPr>
                 <w:b/>
@@ -4065,9 +3869,32 @@
                 <w:szCs w:val="18"/>
                 <w:lang w:val="en-US"/>
               </w:rPr>
-              <w:t>Elaborado</w:t>
-            </w:r>
-            <w:proofErr w:type="spellEnd"/>
+              <w:t>Elaborado por</w:t>
+            </w:r>
+          </w:p>
+        </w:tc>
+        <w:tc>
+          <w:tcPr>
+            <w:tcW w:w="2400" w:type="dxa"/>
+            <w:tcBorders>
+              <w:top w:val="single" w:sz="4" w:space="0" w:color="B7C2D6"/>
+              <w:left w:val="single" w:sz="4" w:space="0" w:color="B7C2D6"/>
+              <w:bottom w:val="single" w:sz="4" w:space="0" w:color="B7C2D6"/>
+              <w:right w:val="single" w:sz="4" w:space="0" w:color="B7C2D6"/>
+            </w:tcBorders>
+            <w:shd w:val="clear" w:color="auto" w:fill="1F3864"/>
+            <w:tcMar>
+              <w:top w:w="80" w:type="dxa"/>
+              <w:left w:w="130" w:type="dxa"/>
+              <w:bottom w:w="80" w:type="dxa"/>
+              <w:right w:w="130" w:type="dxa"/>
+            </w:tcMar>
+            <w:vAlign w:val="center"/>
+          </w:tcPr>
+          <w:p>
+            <w:pPr>
+              <w:jc w:val="center"/>
+            </w:pPr>
             <w:r>
               <w:rPr>
                 <w:b/>
@@ -4077,26 +3904,13 @@
                 <w:szCs w:val="18"/>
                 <w:lang w:val="en-US"/>
               </w:rPr>
-              <w:t xml:space="preserve"> </w:t>
-            </w:r>
-            <w:proofErr w:type="spellStart"/>
-            <w:r>
-              <w:rPr>
-                <w:b/>
-                <w:bCs/>
-                <w:color w:val="FFFFFF"/>
-                <w:sz w:val="18"/>
-                <w:szCs w:val="18"/>
-                <w:lang w:val="en-US"/>
-              </w:rPr>
-              <w:t>por</w:t>
-            </w:r>
-            <w:proofErr w:type="spellEnd"/>
-          </w:p>
-        </w:tc>
-        <w:tc>
-          <w:tcPr>
-            <w:tcW w:w="2400" w:type="dxa"/>
+              <w:t>Aprobado por</w:t>
+            </w:r>
+          </w:p>
+        </w:tc>
+        <w:tc>
+          <w:tcPr>
+            <w:tcW w:w="1800" w:type="dxa"/>
             <w:tcBorders>
               <w:top w:val="single" w:sz="4" w:space="0" w:color="B7C2D6"/>
               <w:left w:val="single" w:sz="4" w:space="0" w:color="B7C2D6"/>
@@ -4116,68 +3930,6 @@
             <w:pPr>
               <w:jc w:val="center"/>
             </w:pPr>
-            <w:proofErr w:type="spellStart"/>
-            <w:r>
-              <w:rPr>
-                <w:b/>
-                <w:bCs/>
-                <w:color w:val="FFFFFF"/>
-                <w:sz w:val="18"/>
-                <w:szCs w:val="18"/>
-                <w:lang w:val="en-US"/>
-              </w:rPr>
-              <w:t>Aprobado</w:t>
-            </w:r>
-            <w:proofErr w:type="spellEnd"/>
-            <w:r>
-              <w:rPr>
-                <w:b/>
-                <w:bCs/>
-                <w:color w:val="FFFFFF"/>
-                <w:sz w:val="18"/>
-                <w:szCs w:val="18"/>
-                <w:lang w:val="en-US"/>
-              </w:rPr>
-              <w:t xml:space="preserve"> </w:t>
-            </w:r>
-            <w:proofErr w:type="spellStart"/>
-            <w:r>
-              <w:rPr>
-                <w:b/>
-                <w:bCs/>
-                <w:color w:val="FFFFFF"/>
-                <w:sz w:val="18"/>
-                <w:szCs w:val="18"/>
-                <w:lang w:val="en-US"/>
-              </w:rPr>
-              <w:t>por</w:t>
-            </w:r>
-            <w:proofErr w:type="spellEnd"/>
-          </w:p>
-        </w:tc>
-        <w:tc>
-          <w:tcPr>
-            <w:tcW w:w="1800" w:type="dxa"/>
-            <w:tcBorders>
-              <w:top w:val="single" w:sz="4" w:space="0" w:color="B7C2D6"/>
-              <w:left w:val="single" w:sz="4" w:space="0" w:color="B7C2D6"/>
-              <w:bottom w:val="single" w:sz="4" w:space="0" w:color="B7C2D6"/>
-              <w:right w:val="single" w:sz="4" w:space="0" w:color="B7C2D6"/>
-            </w:tcBorders>
-            <w:shd w:val="clear" w:color="auto" w:fill="1F3864"/>
-            <w:tcMar>
-              <w:top w:w="80" w:type="dxa"/>
-              <w:left w:w="130" w:type="dxa"/>
-              <w:bottom w:w="80" w:type="dxa"/>
-              <w:right w:w="130" w:type="dxa"/>
-            </w:tcMar>
-            <w:vAlign w:val="center"/>
-          </w:tcPr>
-          <w:p>
-            <w:pPr>
-              <w:jc w:val="center"/>
-            </w:pPr>
-            <w:proofErr w:type="spellStart"/>
             <w:r>
               <w:rPr>
                 <w:b/>
@@ -4189,7 +3941,6 @@
               </w:rPr>
               <w:t>Fecha</w:t>
             </w:r>
-            <w:proofErr w:type="spellEnd"/>
           </w:p>
         </w:tc>
         <w:tc>
@@ -4214,7 +3965,6 @@
             <w:pPr>
               <w:jc w:val="center"/>
             </w:pPr>
-            <w:proofErr w:type="spellStart"/>
             <w:r>
               <w:rPr>
                 <w:b/>
@@ -4224,57 +3974,8 @@
                 <w:szCs w:val="18"/>
                 <w:lang w:val="en-US"/>
               </w:rPr>
-              <w:t>Descripción</w:t>
-            </w:r>
-            <w:proofErr w:type="spellEnd"/>
-            <w:r>
-              <w:rPr>
-                <w:b/>
-                <w:bCs/>
-                <w:color w:val="FFFFFF"/>
-                <w:sz w:val="18"/>
-                <w:szCs w:val="18"/>
-                <w:lang w:val="en-US"/>
-              </w:rPr>
-              <w:t xml:space="preserve"> y </w:t>
-            </w:r>
-            <w:proofErr w:type="spellStart"/>
-            <w:r>
-              <w:rPr>
-                <w:b/>
-                <w:bCs/>
-                <w:color w:val="FFFFFF"/>
-                <w:sz w:val="18"/>
-                <w:szCs w:val="18"/>
-                <w:lang w:val="en-US"/>
-              </w:rPr>
-              <w:t>Justificación</w:t>
-            </w:r>
-            <w:proofErr w:type="spellEnd"/>
-            <w:r>
-              <w:rPr>
-                <w:b/>
-                <w:bCs/>
-                <w:color w:val="FFFFFF"/>
-                <w:sz w:val="18"/>
-                <w:szCs w:val="18"/>
-                <w:lang w:val="en-US"/>
-              </w:rPr>
-              <w:t xml:space="preserve"> de </w:t>
-            </w:r>
-            <w:proofErr w:type="spellStart"/>
-            <w:r>
-              <w:rPr>
-                <w:b/>
-                <w:bCs/>
-                <w:color w:val="FFFFFF"/>
-                <w:sz w:val="18"/>
-                <w:szCs w:val="18"/>
-                <w:lang w:val="en-US"/>
-              </w:rPr>
-              <w:t>Cambios</w:t>
-            </w:r>
-            <w:proofErr w:type="spellEnd"/>
+              <w:t>Descripción y Justificación de Cambios</w:t>
+            </w:r>
           </w:p>
         </w:tc>
       </w:tr>
@@ -4374,7 +4075,6 @@
             <w:vAlign w:val="center"/>
           </w:tcPr>
           <w:p>
-            <w:proofErr w:type="spellStart"/>
             <w:r>
               <w:rPr>
                 <w:color w:val="1A1A1A"/>
@@ -4382,57 +4082,7 @@
                 <w:szCs w:val="20"/>
                 <w:lang w:val="en-US"/>
               </w:rPr>
-              <w:t>Versión</w:t>
-            </w:r>
-            <w:proofErr w:type="spellEnd"/>
-            <w:r>
-              <w:rPr>
-                <w:color w:val="1A1A1A"/>
-                <w:sz w:val="20"/>
-                <w:szCs w:val="20"/>
-                <w:lang w:val="en-US"/>
-              </w:rPr>
-              <w:t xml:space="preserve"> </w:t>
-            </w:r>
-            <w:proofErr w:type="spellStart"/>
-            <w:r>
-              <w:rPr>
-                <w:color w:val="1A1A1A"/>
-                <w:sz w:val="20"/>
-                <w:szCs w:val="20"/>
-                <w:lang w:val="en-US"/>
-              </w:rPr>
-              <w:t>inicial</w:t>
-            </w:r>
-            <w:proofErr w:type="spellEnd"/>
-            <w:r>
-              <w:rPr>
-                <w:color w:val="1A1A1A"/>
-                <w:sz w:val="20"/>
-                <w:szCs w:val="20"/>
-                <w:lang w:val="en-US"/>
-              </w:rPr>
-              <w:t xml:space="preserve"> del </w:t>
-            </w:r>
-            <w:proofErr w:type="spellStart"/>
-            <w:r>
-              <w:rPr>
-                <w:color w:val="1A1A1A"/>
-                <w:sz w:val="20"/>
-                <w:szCs w:val="20"/>
-                <w:lang w:val="en-US"/>
-              </w:rPr>
-              <w:t>documento</w:t>
-            </w:r>
-            <w:proofErr w:type="spellEnd"/>
-            <w:r>
-              <w:rPr>
-                <w:color w:val="1A1A1A"/>
-                <w:sz w:val="20"/>
-                <w:szCs w:val="20"/>
-                <w:lang w:val="en-US"/>
-              </w:rPr>
-              <w:t>.</w:t>
+              <w:t>Versión inicial del documento.</w:t>
             </w:r>
           </w:p>
         </w:tc>
@@ -4709,27 +4359,7 @@
                 <w:szCs w:val="13"/>
                 <w:lang w:val="en-US"/>
               </w:rPr>
-              <w:t xml:space="preserve">Desarrollo y </w:t>
-            </w:r>
-            <w:proofErr w:type="spellStart"/>
-            <w:r>
-              <w:rPr>
-                <w:color w:val="B9C9E6"/>
-                <w:sz w:val="13"/>
-                <w:szCs w:val="13"/>
-                <w:lang w:val="en-US"/>
-              </w:rPr>
-              <w:t>Operaciones</w:t>
-            </w:r>
-            <w:proofErr w:type="spellEnd"/>
-            <w:r>
-              <w:rPr>
-                <w:color w:val="B9C9E6"/>
-                <w:sz w:val="13"/>
-                <w:szCs w:val="13"/>
-                <w:lang w:val="en-US"/>
-              </w:rPr>
-              <w:t xml:space="preserve"> de Software</w:t>
+              <w:t>Desarrollo y Operaciones de Software</w:t>
             </w:r>
           </w:p>
         </w:tc>
@@ -4781,7 +4411,6 @@
             <w:vAlign w:val="center"/>
           </w:tcPr>
           <w:p>
-            <w:proofErr w:type="spellStart"/>
             <w:r>
               <w:rPr>
                 <w:b/>
@@ -4791,19 +4420,7 @@
                 <w:szCs w:val="18"/>
                 <w:lang w:val="en-US"/>
               </w:rPr>
-              <w:t>Fecha</w:t>
-            </w:r>
-            <w:proofErr w:type="spellEnd"/>
-            <w:r>
-              <w:rPr>
-                <w:b/>
-                <w:bCs/>
-                <w:color w:val="1F3864"/>
-                <w:sz w:val="18"/>
-                <w:szCs w:val="18"/>
-                <w:lang w:val="en-US"/>
-              </w:rPr>
-              <w:t>:</w:t>
+              <w:t>Fecha:</w:t>
             </w:r>
           </w:p>
         </w:tc>
@@ -5142,7 +4759,6 @@
             <w:vAlign w:val="center"/>
           </w:tcPr>
           <w:p>
-            <w:proofErr w:type="spellStart"/>
             <w:r>
               <w:rPr>
                 <w:b/>
@@ -5152,9 +4768,57 @@
                 <w:szCs w:val="20"/>
                 <w:lang w:val="en-US"/>
               </w:rPr>
-              <w:t>Descripción</w:t>
-            </w:r>
-            <w:proofErr w:type="spellEnd"/>
+              <w:t>Descripción:</w:t>
+            </w:r>
+          </w:p>
+        </w:tc>
+        <w:tc>
+          <w:tcPr>
+            <w:tcW w:w="7280" w:type="dxa"/>
+            <w:tcBorders>
+              <w:top w:val="single" w:sz="4" w:space="0" w:color="B7C2D6"/>
+              <w:left w:val="single" w:sz="4" w:space="0" w:color="B7C2D6"/>
+              <w:bottom w:val="single" w:sz="4" w:space="0" w:color="B7C2D6"/>
+              <w:right w:val="single" w:sz="4" w:space="0" w:color="B7C2D6"/>
+            </w:tcBorders>
+            <w:tcMar>
+              <w:top w:w="80" w:type="dxa"/>
+              <w:left w:w="130" w:type="dxa"/>
+              <w:bottom w:w="80" w:type="dxa"/>
+              <w:right w:w="130" w:type="dxa"/>
+            </w:tcMar>
+            <w:vAlign w:val="center"/>
+          </w:tcPr>
+          <w:p>
+            <w:r>
+              <w:t>P</w:t>
+            </w:r>
+            <w:r>
+              <w:t>ermitir al cliente construir un pedido</w:t>
+            </w:r>
+          </w:p>
+        </w:tc>
+      </w:tr>
+      <w:tr>
+        <w:tc>
+          <w:tcPr>
+            <w:tcW w:w="2800" w:type="dxa"/>
+            <w:tcBorders>
+              <w:top w:val="single" w:sz="4" w:space="0" w:color="B7C2D6"/>
+              <w:left w:val="single" w:sz="4" w:space="0" w:color="B7C2D6"/>
+              <w:bottom w:val="single" w:sz="4" w:space="0" w:color="B7C2D6"/>
+              <w:right w:val="single" w:sz="4" w:space="0" w:color="B7C2D6"/>
+            </w:tcBorders>
+            <w:shd w:val="clear" w:color="auto" w:fill="F2F4F7"/>
+            <w:tcMar>
+              <w:top w:w="80" w:type="dxa"/>
+              <w:left w:w="130" w:type="dxa"/>
+              <w:bottom w:w="80" w:type="dxa"/>
+              <w:right w:w="130" w:type="dxa"/>
+            </w:tcMar>
+            <w:vAlign w:val="center"/>
+          </w:tcPr>
+          <w:p>
             <w:r>
               <w:rPr>
                 <w:b/>
@@ -5164,7 +4828,7 @@
                 <w:szCs w:val="20"/>
                 <w:lang w:val="en-US"/>
               </w:rPr>
-              <w:t>:</w:t>
+              <w:t>Cómo se ejecutará:</w:t>
             </w:r>
           </w:p>
         </w:tc>
@@ -5187,10 +4851,7 @@
           </w:tcPr>
           <w:p>
             <w:r>
-              <w:t>P</w:t>
-            </w:r>
-            <w:r>
-              <w:t>ermitir al cliente construir un pedido</w:t>
+              <w:t>El cliente accede a la pantalla principal, selecciona productos del menú y los va añadiendo a su pedido en construcción. Una vez terminado, elige su preferencia de entrega y confirma.</w:t>
             </w:r>
           </w:p>
         </w:tc>
@@ -5215,7 +4876,62 @@
             <w:vAlign w:val="center"/>
           </w:tcPr>
           <w:p>
-            <w:proofErr w:type="spellStart"/>
+            <w:r>
+              <w:rPr>
+                <w:b/>
+                <w:bCs/>
+                <w:color w:val="1F3864"/>
+                <w:sz w:val="20"/>
+                <w:szCs w:val="20"/>
+              </w:rPr>
+              <w:t>Actor principal:</w:t>
+            </w:r>
+          </w:p>
+        </w:tc>
+        <w:tc>
+          <w:tcPr>
+            <w:tcW w:w="7280" w:type="dxa"/>
+            <w:tcBorders>
+              <w:top w:val="single" w:sz="4" w:space="0" w:color="B7C2D6"/>
+              <w:left w:val="single" w:sz="4" w:space="0" w:color="B7C2D6"/>
+              <w:bottom w:val="single" w:sz="4" w:space="0" w:color="B7C2D6"/>
+              <w:right w:val="single" w:sz="4" w:space="0" w:color="B7C2D6"/>
+            </w:tcBorders>
+            <w:tcMar>
+              <w:top w:w="80" w:type="dxa"/>
+              <w:left w:w="130" w:type="dxa"/>
+              <w:bottom w:w="80" w:type="dxa"/>
+              <w:right w:w="130" w:type="dxa"/>
+            </w:tcMar>
+            <w:vAlign w:val="center"/>
+          </w:tcPr>
+          <w:p>
+            <w:r>
+              <w:t>Cliente (Estudiante o Profesor)</w:t>
+            </w:r>
+          </w:p>
+        </w:tc>
+      </w:tr>
+      <w:tr>
+        <w:tc>
+          <w:tcPr>
+            <w:tcW w:w="2800" w:type="dxa"/>
+            <w:tcBorders>
+              <w:top w:val="single" w:sz="4" w:space="0" w:color="B7C2D6"/>
+              <w:left w:val="single" w:sz="4" w:space="0" w:color="B7C2D6"/>
+              <w:bottom w:val="single" w:sz="4" w:space="0" w:color="B7C2D6"/>
+              <w:right w:val="single" w:sz="4" w:space="0" w:color="B7C2D6"/>
+            </w:tcBorders>
+            <w:shd w:val="clear" w:color="auto" w:fill="F2F4F7"/>
+            <w:tcMar>
+              <w:top w:w="80" w:type="dxa"/>
+              <w:left w:w="130" w:type="dxa"/>
+              <w:bottom w:w="80" w:type="dxa"/>
+              <w:right w:w="130" w:type="dxa"/>
+            </w:tcMar>
+            <w:vAlign w:val="center"/>
+          </w:tcPr>
+          <w:p>
             <w:r>
               <w:rPr>
                 <w:b/>
@@ -5225,169 +4941,7 @@
                 <w:szCs w:val="20"/>
                 <w:lang w:val="en-US"/>
               </w:rPr>
-              <w:t>Cómo</w:t>
-            </w:r>
-            <w:proofErr w:type="spellEnd"/>
-            <w:r>
-              <w:rPr>
-                <w:b/>
-                <w:bCs/>
-                <w:color w:val="1F3864"/>
-                <w:sz w:val="20"/>
-                <w:szCs w:val="20"/>
-                <w:lang w:val="en-US"/>
-              </w:rPr>
-              <w:t xml:space="preserve"> se </w:t>
-            </w:r>
-            <w:proofErr w:type="spellStart"/>
-            <w:r>
-              <w:rPr>
-                <w:b/>
-                <w:bCs/>
-                <w:color w:val="1F3864"/>
-                <w:sz w:val="20"/>
-                <w:szCs w:val="20"/>
-                <w:lang w:val="en-US"/>
-              </w:rPr>
-              <w:t>ejecutará</w:t>
-            </w:r>
-            <w:proofErr w:type="spellEnd"/>
-            <w:r>
-              <w:rPr>
-                <w:b/>
-                <w:bCs/>
-                <w:color w:val="1F3864"/>
-                <w:sz w:val="20"/>
-                <w:szCs w:val="20"/>
-                <w:lang w:val="en-US"/>
-              </w:rPr>
-              <w:t>:</w:t>
-            </w:r>
-          </w:p>
-        </w:tc>
-        <w:tc>
-          <w:tcPr>
-            <w:tcW w:w="7280" w:type="dxa"/>
-            <w:tcBorders>
-              <w:top w:val="single" w:sz="4" w:space="0" w:color="B7C2D6"/>
-              <w:left w:val="single" w:sz="4" w:space="0" w:color="B7C2D6"/>
-              <w:bottom w:val="single" w:sz="4" w:space="0" w:color="B7C2D6"/>
-              <w:right w:val="single" w:sz="4" w:space="0" w:color="B7C2D6"/>
-            </w:tcBorders>
-            <w:tcMar>
-              <w:top w:w="80" w:type="dxa"/>
-              <w:left w:w="130" w:type="dxa"/>
-              <w:bottom w:w="80" w:type="dxa"/>
-              <w:right w:w="130" w:type="dxa"/>
-            </w:tcMar>
-            <w:vAlign w:val="center"/>
-          </w:tcPr>
-          <w:p>
-            <w:r>
-              <w:t>El cliente accede a la pantalla principal, selecciona productos del menú y los va añadiendo a su pedido en construcción. Una vez terminado, elige su preferencia de entrega y confirma.</w:t>
-            </w:r>
-          </w:p>
-        </w:tc>
-      </w:tr>
-      <w:tr>
-        <w:tc>
-          <w:tcPr>
-            <w:tcW w:w="2800" w:type="dxa"/>
-            <w:tcBorders>
-              <w:top w:val="single" w:sz="4" w:space="0" w:color="B7C2D6"/>
-              <w:left w:val="single" w:sz="4" w:space="0" w:color="B7C2D6"/>
-              <w:bottom w:val="single" w:sz="4" w:space="0" w:color="B7C2D6"/>
-              <w:right w:val="single" w:sz="4" w:space="0" w:color="B7C2D6"/>
-            </w:tcBorders>
-            <w:shd w:val="clear" w:color="auto" w:fill="F2F4F7"/>
-            <w:tcMar>
-              <w:top w:w="80" w:type="dxa"/>
-              <w:left w:w="130" w:type="dxa"/>
-              <w:bottom w:w="80" w:type="dxa"/>
-              <w:right w:w="130" w:type="dxa"/>
-            </w:tcMar>
-            <w:vAlign w:val="center"/>
-          </w:tcPr>
-          <w:p>
-            <w:r>
-              <w:rPr>
-                <w:b/>
-                <w:bCs/>
-                <w:color w:val="1F3864"/>
-                <w:sz w:val="20"/>
-                <w:szCs w:val="20"/>
-              </w:rPr>
-              <w:t>Actor principal:</w:t>
-            </w:r>
-          </w:p>
-        </w:tc>
-        <w:tc>
-          <w:tcPr>
-            <w:tcW w:w="7280" w:type="dxa"/>
-            <w:tcBorders>
-              <w:top w:val="single" w:sz="4" w:space="0" w:color="B7C2D6"/>
-              <w:left w:val="single" w:sz="4" w:space="0" w:color="B7C2D6"/>
-              <w:bottom w:val="single" w:sz="4" w:space="0" w:color="B7C2D6"/>
-              <w:right w:val="single" w:sz="4" w:space="0" w:color="B7C2D6"/>
-            </w:tcBorders>
-            <w:tcMar>
-              <w:top w:w="80" w:type="dxa"/>
-              <w:left w:w="130" w:type="dxa"/>
-              <w:bottom w:w="80" w:type="dxa"/>
-              <w:right w:w="130" w:type="dxa"/>
-            </w:tcMar>
-            <w:vAlign w:val="center"/>
-          </w:tcPr>
-          <w:p>
-            <w:r>
-              <w:t>Cliente (Estudiante o Profesor)</w:t>
-            </w:r>
-          </w:p>
-        </w:tc>
-      </w:tr>
-      <w:tr>
-        <w:tc>
-          <w:tcPr>
-            <w:tcW w:w="2800" w:type="dxa"/>
-            <w:tcBorders>
-              <w:top w:val="single" w:sz="4" w:space="0" w:color="B7C2D6"/>
-              <w:left w:val="single" w:sz="4" w:space="0" w:color="B7C2D6"/>
-              <w:bottom w:val="single" w:sz="4" w:space="0" w:color="B7C2D6"/>
-              <w:right w:val="single" w:sz="4" w:space="0" w:color="B7C2D6"/>
-            </w:tcBorders>
-            <w:shd w:val="clear" w:color="auto" w:fill="F2F4F7"/>
-            <w:tcMar>
-              <w:top w:w="80" w:type="dxa"/>
-              <w:left w:w="130" w:type="dxa"/>
-              <w:bottom w:w="80" w:type="dxa"/>
-              <w:right w:w="130" w:type="dxa"/>
-            </w:tcMar>
-            <w:vAlign w:val="center"/>
-          </w:tcPr>
-          <w:p>
-            <w:proofErr w:type="spellStart"/>
-            <w:r>
-              <w:rPr>
-                <w:b/>
-                <w:bCs/>
-                <w:color w:val="1F3864"/>
-                <w:sz w:val="20"/>
-                <w:szCs w:val="20"/>
-                <w:lang w:val="en-US"/>
-              </w:rPr>
-              <w:t>Precondiciones</w:t>
-            </w:r>
-            <w:proofErr w:type="spellEnd"/>
-            <w:r>
-              <w:rPr>
-                <w:b/>
-                <w:bCs/>
-                <w:color w:val="1F3864"/>
-                <w:sz w:val="20"/>
-                <w:szCs w:val="20"/>
-                <w:lang w:val="en-US"/>
-              </w:rPr>
-              <w:t>:</w:t>
+              <w:t>Precondiciones:</w:t>
             </w:r>
           </w:p>
         </w:tc>
@@ -5528,7 +5082,6 @@
             <w:pPr>
               <w:jc w:val="center"/>
             </w:pPr>
-            <w:proofErr w:type="spellStart"/>
             <w:r>
               <w:rPr>
                 <w:b/>
@@ -5540,7 +5093,6 @@
               </w:rPr>
               <w:t>Descripción</w:t>
             </w:r>
-            <w:proofErr w:type="spellEnd"/>
           </w:p>
         </w:tc>
         <w:tc>
@@ -5608,21 +5160,8 @@
                 <w:szCs w:val="18"/>
                 <w:lang w:val="en-US"/>
               </w:rPr>
-              <w:t xml:space="preserve">Reglas / </w:t>
-            </w:r>
-            <w:proofErr w:type="spellStart"/>
-            <w:r>
-              <w:rPr>
-                <w:b/>
-                <w:bCs/>
-                <w:color w:val="FFFFFF"/>
-                <w:sz w:val="18"/>
-                <w:szCs w:val="18"/>
-                <w:lang w:val="en-US"/>
-              </w:rPr>
-              <w:t>Aplicación</w:t>
-            </w:r>
-            <w:proofErr w:type="spellEnd"/>
+              <w:t>Reglas / Aplicación</w:t>
+            </w:r>
           </w:p>
         </w:tc>
         <w:tc>
@@ -5647,7 +5186,6 @@
             <w:pPr>
               <w:jc w:val="center"/>
             </w:pPr>
-            <w:proofErr w:type="spellStart"/>
             <w:r>
               <w:rPr>
                 <w:b/>
@@ -5659,7 +5197,6 @@
               </w:rPr>
               <w:t>Obligatorio</w:t>
             </w:r>
-            <w:proofErr w:type="spellEnd"/>
           </w:p>
         </w:tc>
       </w:tr>
@@ -5751,13 +5288,8 @@
             <w:vAlign w:val="center"/>
           </w:tcPr>
           <w:p>
-            <w:proofErr w:type="spellStart"/>
-            <w:r>
-              <w:t>Maximo</w:t>
-            </w:r>
-            <w:proofErr w:type="spellEnd"/>
-            <w:r>
-              <w:t xml:space="preserve"> 5 productos diferentes</w:t>
+            <w:r>
+              <w:t>Maximo 5 productos diferentes</w:t>
             </w:r>
           </w:p>
         </w:tc>
@@ -5850,11 +5382,9 @@
             <w:vAlign w:val="center"/>
           </w:tcPr>
           <w:p>
-            <w:proofErr w:type="spellStart"/>
             <w:r>
               <w:t>Enum</w:t>
             </w:r>
-            <w:proofErr w:type="spellEnd"/>
           </w:p>
         </w:tc>
         <w:tc>
@@ -5946,13 +5476,8 @@
             <w:vAlign w:val="center"/>
           </w:tcPr>
           <w:p>
-            <w:proofErr w:type="spellStart"/>
-            <w:r>
-              <w:t>Personalizacion</w:t>
-            </w:r>
-            <w:proofErr w:type="spellEnd"/>
-            <w:r>
-              <w:t xml:space="preserve"> adicionales de cada producto</w:t>
+            <w:r>
+              <w:t>Personalizacion adicionales de cada producto</w:t>
             </w:r>
           </w:p>
         </w:tc>
@@ -6162,7 +5687,6 @@
             <w:pPr>
               <w:jc w:val="center"/>
             </w:pPr>
-            <w:proofErr w:type="spellStart"/>
             <w:r>
               <w:rPr>
                 <w:b/>
@@ -6174,7 +5698,6 @@
               </w:rPr>
               <w:t>Descripción</w:t>
             </w:r>
-            <w:proofErr w:type="spellEnd"/>
           </w:p>
         </w:tc>
         <w:tc>
@@ -6242,21 +5765,8 @@
                 <w:szCs w:val="18"/>
                 <w:lang w:val="en-US"/>
               </w:rPr>
-              <w:t xml:space="preserve">Reglas / </w:t>
-            </w:r>
-            <w:proofErr w:type="spellStart"/>
-            <w:r>
-              <w:rPr>
-                <w:b/>
-                <w:bCs/>
-                <w:color w:val="FFFFFF"/>
-                <w:sz w:val="18"/>
-                <w:szCs w:val="18"/>
-                <w:lang w:val="en-US"/>
-              </w:rPr>
-              <w:t>Aplicación</w:t>
-            </w:r>
-            <w:proofErr w:type="spellEnd"/>
+              <w:t>Reglas / Aplicación</w:t>
+            </w:r>
           </w:p>
         </w:tc>
         <w:tc>
@@ -6281,7 +5791,6 @@
             <w:pPr>
               <w:jc w:val="center"/>
             </w:pPr>
-            <w:proofErr w:type="spellStart"/>
             <w:r>
               <w:rPr>
                 <w:b/>
@@ -6293,7 +5802,6 @@
               </w:rPr>
               <w:t>Obligatorio</w:t>
             </w:r>
-            <w:proofErr w:type="spellEnd"/>
           </w:p>
         </w:tc>
       </w:tr>
@@ -6453,15 +5961,7 @@
           </w:tcPr>
           <w:p>
             <w:r>
-              <w:t xml:space="preserve">Suma de los precios base de todos los productos </w:t>
-            </w:r>
-            <w:proofErr w:type="spellStart"/>
-            <w:r>
-              <w:t>mas</w:t>
-            </w:r>
-            <w:proofErr w:type="spellEnd"/>
-            <w:r>
-              <w:t xml:space="preserve"> de los extras seleccionados</w:t>
+              <w:t>Suma de los precios base de todos los productos mas de los extras seleccionados</w:t>
             </w:r>
           </w:p>
         </w:tc>
@@ -6790,7 +6290,6 @@
             <w:pPr>
               <w:jc w:val="center"/>
             </w:pPr>
-            <w:proofErr w:type="spellStart"/>
             <w:r>
               <w:rPr>
                 <w:b/>
@@ -6802,7 +6301,6 @@
               </w:rPr>
               <w:t>Descripción</w:t>
             </w:r>
-            <w:proofErr w:type="spellEnd"/>
           </w:p>
         </w:tc>
         <w:tc>
@@ -6827,7 +6325,6 @@
             <w:pPr>
               <w:jc w:val="center"/>
             </w:pPr>
-            <w:proofErr w:type="spellStart"/>
             <w:r>
               <w:rPr>
                 <w:b/>
@@ -6839,7 +6336,6 @@
               </w:rPr>
               <w:t>Excepciones</w:t>
             </w:r>
-            <w:proofErr w:type="spellEnd"/>
           </w:p>
         </w:tc>
       </w:tr>
@@ -7595,7 +7091,6 @@
             <w:pPr>
               <w:jc w:val="center"/>
             </w:pPr>
-            <w:proofErr w:type="spellStart"/>
             <w:r>
               <w:rPr>
                 <w:b/>
@@ -7607,7 +7102,6 @@
               </w:rPr>
               <w:t>Descripción</w:t>
             </w:r>
-            <w:proofErr w:type="spellEnd"/>
           </w:p>
         </w:tc>
         <w:tc>
@@ -7632,7 +7126,6 @@
             <w:pPr>
               <w:jc w:val="center"/>
             </w:pPr>
-            <w:proofErr w:type="spellStart"/>
             <w:r>
               <w:rPr>
                 <w:b/>
@@ -7644,7 +7137,6 @@
               </w:rPr>
               <w:t>Excepciones</w:t>
             </w:r>
-            <w:proofErr w:type="spellEnd"/>
           </w:p>
         </w:tc>
       </w:tr>
@@ -7714,7 +7206,15 @@
           </w:tcPr>
           <w:p>
             <w:r>
-              <w:t>El sistema no tiene productos disponibles → Mostrar mensaje de "Menú no disponible</w:t>
+              <w:t xml:space="preserve">El sistema no tiene productos </w:t>
+            </w:r>
+            <w:proofErr w:type="gramStart"/>
+            <w:r>
+              <w:t>disponibles  Mostrar</w:t>
+            </w:r>
+            <w:proofErr w:type="gramEnd"/>
+            <w:r>
+              <w:t xml:space="preserve"> mensaje de "Menú no disponible</w:t>
             </w:r>
           </w:p>
         </w:tc>
@@ -7804,7 +7304,10 @@
           </w:tcPr>
           <w:p>
             <w:r>
-              <w:t>El pedido ya contiene 5 productos → El sistema bloquea la adición y notifica al cliente.</w:t>
+              <w:t>El pedido ya contiene 5 productos</w:t>
+            </w:r>
+            <w:r>
+              <w:t xml:space="preserve"> </w:t>
             </w:r>
           </w:p>
         </w:tc>
@@ -7894,7 +7397,7 @@
           </w:tcPr>
           <w:p>
             <w:r>
-              <w:t>El cliente no selecciona una opción → El sistema no habilita el botón de confirmar.</w:t>
+              <w:t>El cliente no selecciona una opción</w:t>
             </w:r>
           </w:p>
         </w:tc>
@@ -7962,7 +7465,6 @@
             <w:vAlign w:val="center"/>
           </w:tcPr>
           <w:p>
-            <w:proofErr w:type="spellStart"/>
             <w:r>
               <w:rPr>
                 <w:b/>
@@ -7972,44 +7474,7 @@
                 <w:szCs w:val="20"/>
                 <w:lang w:val="en-US"/>
               </w:rPr>
-              <w:lastRenderedPageBreak/>
-              <w:t>Notas</w:t>
-            </w:r>
-            <w:proofErr w:type="spellEnd"/>
-            <w:r>
-              <w:rPr>
-                <w:b/>
-                <w:bCs/>
-                <w:color w:val="1F3864"/>
-                <w:sz w:val="20"/>
-                <w:szCs w:val="20"/>
-                <w:lang w:val="en-US"/>
-              </w:rPr>
-              <w:t xml:space="preserve"> y </w:t>
-            </w:r>
-            <w:proofErr w:type="spellStart"/>
-            <w:r>
-              <w:rPr>
-                <w:b/>
-                <w:bCs/>
-                <w:color w:val="1F3864"/>
-                <w:sz w:val="20"/>
-                <w:szCs w:val="20"/>
-                <w:lang w:val="en-US"/>
-              </w:rPr>
-              <w:t>comentarios</w:t>
-            </w:r>
-            <w:proofErr w:type="spellEnd"/>
-            <w:r>
-              <w:rPr>
-                <w:b/>
-                <w:bCs/>
-                <w:color w:val="1F3864"/>
-                <w:sz w:val="20"/>
-                <w:szCs w:val="20"/>
-                <w:lang w:val="en-US"/>
-              </w:rPr>
-              <w:t>:</w:t>
+              <w:t>Notas y comentarios:</w:t>
             </w:r>
           </w:p>
         </w:tc>
@@ -8054,6 +7519,7 @@
           <w:sz w:val="24"/>
           <w:szCs w:val="24"/>
         </w:rPr>
+        <w:lastRenderedPageBreak/>
         <w:t>ANEXOS</w:t>
       </w:r>
     </w:p>
@@ -8071,7 +7537,6 @@
           <w:between w:val="nil"/>
         </w:pBdr>
       </w:pPr>
-      <w:proofErr w:type="spellStart"/>
       <w:r>
         <w:rPr>
           <w:color w:val="000000"/>
@@ -8079,7 +7544,6 @@
         </w:rPr>
         <w:t>Prototipos</w:t>
       </w:r>
-      <w:proofErr w:type="spellEnd"/>
     </w:p>
     <w:p>
       <w:pPr>
@@ -8177,7 +7641,6 @@
             <w:pPr>
               <w:jc w:val="center"/>
             </w:pPr>
-            <w:proofErr w:type="spellStart"/>
             <w:r>
               <w:rPr>
                 <w:b/>
@@ -8189,7 +7652,6 @@
               </w:rPr>
               <w:t>Descripción</w:t>
             </w:r>
-            <w:proofErr w:type="spellEnd"/>
           </w:p>
         </w:tc>
       </w:tr>
@@ -8405,7 +7867,6 @@
             <w:pPr>
               <w:jc w:val="center"/>
             </w:pPr>
-            <w:proofErr w:type="spellStart"/>
             <w:r>
               <w:rPr>
                 <w:b/>
@@ -8417,7 +7878,6 @@
               </w:rPr>
               <w:t>Abreviatura</w:t>
             </w:r>
-            <w:proofErr w:type="spellEnd"/>
           </w:p>
         </w:tc>
         <w:tc>
@@ -8442,7 +7902,6 @@
             <w:pPr>
               <w:jc w:val="center"/>
             </w:pPr>
-            <w:proofErr w:type="spellStart"/>
             <w:r>
               <w:rPr>
                 <w:b/>
@@ -8454,7 +7913,6 @@
               </w:rPr>
               <w:t>Significado</w:t>
             </w:r>
-            <w:proofErr w:type="spellEnd"/>
           </w:p>
         </w:tc>
       </w:tr>
@@ -8648,7 +8106,6 @@
             <w:pPr>
               <w:jc w:val="center"/>
             </w:pPr>
-            <w:proofErr w:type="spellStart"/>
             <w:r>
               <w:rPr>
                 <w:b/>
@@ -8658,9 +8115,32 @@
                 <w:szCs w:val="18"/>
                 <w:lang w:val="en-US"/>
               </w:rPr>
-              <w:t>Elaborado</w:t>
-            </w:r>
-            <w:proofErr w:type="spellEnd"/>
+              <w:t>Elaborado por</w:t>
+            </w:r>
+          </w:p>
+        </w:tc>
+        <w:tc>
+          <w:tcPr>
+            <w:tcW w:w="2400" w:type="dxa"/>
+            <w:tcBorders>
+              <w:top w:val="single" w:sz="4" w:space="0" w:color="B7C2D6"/>
+              <w:left w:val="single" w:sz="4" w:space="0" w:color="B7C2D6"/>
+              <w:bottom w:val="single" w:sz="4" w:space="0" w:color="B7C2D6"/>
+              <w:right w:val="single" w:sz="4" w:space="0" w:color="B7C2D6"/>
+            </w:tcBorders>
+            <w:shd w:val="clear" w:color="auto" w:fill="1F3864"/>
+            <w:tcMar>
+              <w:top w:w="80" w:type="dxa"/>
+              <w:left w:w="130" w:type="dxa"/>
+              <w:bottom w:w="80" w:type="dxa"/>
+              <w:right w:w="130" w:type="dxa"/>
+            </w:tcMar>
+            <w:vAlign w:val="center"/>
+          </w:tcPr>
+          <w:p>
+            <w:pPr>
+              <w:jc w:val="center"/>
+            </w:pPr>
             <w:r>
               <w:rPr>
                 <w:b/>
@@ -8670,26 +8150,13 @@
                 <w:szCs w:val="18"/>
                 <w:lang w:val="en-US"/>
               </w:rPr>
-              <w:t xml:space="preserve"> </w:t>
-            </w:r>
-            <w:proofErr w:type="spellStart"/>
-            <w:r>
-              <w:rPr>
-                <w:b/>
-                <w:bCs/>
-                <w:color w:val="FFFFFF"/>
-                <w:sz w:val="18"/>
-                <w:szCs w:val="18"/>
-                <w:lang w:val="en-US"/>
-              </w:rPr>
-              <w:t>por</w:t>
-            </w:r>
-            <w:proofErr w:type="spellEnd"/>
-          </w:p>
-        </w:tc>
-        <w:tc>
-          <w:tcPr>
-            <w:tcW w:w="2400" w:type="dxa"/>
+              <w:t>Aprobado por</w:t>
+            </w:r>
+          </w:p>
+        </w:tc>
+        <w:tc>
+          <w:tcPr>
+            <w:tcW w:w="1800" w:type="dxa"/>
             <w:tcBorders>
               <w:top w:val="single" w:sz="4" w:space="0" w:color="B7C2D6"/>
               <w:left w:val="single" w:sz="4" w:space="0" w:color="B7C2D6"/>
@@ -8709,68 +8176,6 @@
             <w:pPr>
               <w:jc w:val="center"/>
             </w:pPr>
-            <w:proofErr w:type="spellStart"/>
-            <w:r>
-              <w:rPr>
-                <w:b/>
-                <w:bCs/>
-                <w:color w:val="FFFFFF"/>
-                <w:sz w:val="18"/>
-                <w:szCs w:val="18"/>
-                <w:lang w:val="en-US"/>
-              </w:rPr>
-              <w:t>Aprobado</w:t>
-            </w:r>
-            <w:proofErr w:type="spellEnd"/>
-            <w:r>
-              <w:rPr>
-                <w:b/>
-                <w:bCs/>
-                <w:color w:val="FFFFFF"/>
-                <w:sz w:val="18"/>
-                <w:szCs w:val="18"/>
-                <w:lang w:val="en-US"/>
-              </w:rPr>
-              <w:t xml:space="preserve"> </w:t>
-            </w:r>
-            <w:proofErr w:type="spellStart"/>
-            <w:r>
-              <w:rPr>
-                <w:b/>
-                <w:bCs/>
-                <w:color w:val="FFFFFF"/>
-                <w:sz w:val="18"/>
-                <w:szCs w:val="18"/>
-                <w:lang w:val="en-US"/>
-              </w:rPr>
-              <w:t>por</w:t>
-            </w:r>
-            <w:proofErr w:type="spellEnd"/>
-          </w:p>
-        </w:tc>
-        <w:tc>
-          <w:tcPr>
-            <w:tcW w:w="1800" w:type="dxa"/>
-            <w:tcBorders>
-              <w:top w:val="single" w:sz="4" w:space="0" w:color="B7C2D6"/>
-              <w:left w:val="single" w:sz="4" w:space="0" w:color="B7C2D6"/>
-              <w:bottom w:val="single" w:sz="4" w:space="0" w:color="B7C2D6"/>
-              <w:right w:val="single" w:sz="4" w:space="0" w:color="B7C2D6"/>
-            </w:tcBorders>
-            <w:shd w:val="clear" w:color="auto" w:fill="1F3864"/>
-            <w:tcMar>
-              <w:top w:w="80" w:type="dxa"/>
-              <w:left w:w="130" w:type="dxa"/>
-              <w:bottom w:w="80" w:type="dxa"/>
-              <w:right w:w="130" w:type="dxa"/>
-            </w:tcMar>
-            <w:vAlign w:val="center"/>
-          </w:tcPr>
-          <w:p>
-            <w:pPr>
-              <w:jc w:val="center"/>
-            </w:pPr>
-            <w:proofErr w:type="spellStart"/>
             <w:r>
               <w:rPr>
                 <w:b/>
@@ -8782,7 +8187,6 @@
               </w:rPr>
               <w:t>Fecha</w:t>
             </w:r>
-            <w:proofErr w:type="spellEnd"/>
           </w:p>
         </w:tc>
         <w:tc>
@@ -8807,7 +8211,6 @@
             <w:pPr>
               <w:jc w:val="center"/>
             </w:pPr>
-            <w:proofErr w:type="spellStart"/>
             <w:r>
               <w:rPr>
                 <w:b/>
@@ -8817,57 +8220,8 @@
                 <w:szCs w:val="18"/>
                 <w:lang w:val="en-US"/>
               </w:rPr>
-              <w:t>Descripción</w:t>
-            </w:r>
-            <w:proofErr w:type="spellEnd"/>
-            <w:r>
-              <w:rPr>
-                <w:b/>
-                <w:bCs/>
-                <w:color w:val="FFFFFF"/>
-                <w:sz w:val="18"/>
-                <w:szCs w:val="18"/>
-                <w:lang w:val="en-US"/>
-              </w:rPr>
-              <w:t xml:space="preserve"> y </w:t>
-            </w:r>
-            <w:proofErr w:type="spellStart"/>
-            <w:r>
-              <w:rPr>
-                <w:b/>
-                <w:bCs/>
-                <w:color w:val="FFFFFF"/>
-                <w:sz w:val="18"/>
-                <w:szCs w:val="18"/>
-                <w:lang w:val="en-US"/>
-              </w:rPr>
-              <w:t>Justificación</w:t>
-            </w:r>
-            <w:proofErr w:type="spellEnd"/>
-            <w:r>
-              <w:rPr>
-                <w:b/>
-                <w:bCs/>
-                <w:color w:val="FFFFFF"/>
-                <w:sz w:val="18"/>
-                <w:szCs w:val="18"/>
-                <w:lang w:val="en-US"/>
-              </w:rPr>
-              <w:t xml:space="preserve"> de </w:t>
-            </w:r>
-            <w:proofErr w:type="spellStart"/>
-            <w:r>
-              <w:rPr>
-                <w:b/>
-                <w:bCs/>
-                <w:color w:val="FFFFFF"/>
-                <w:sz w:val="18"/>
-                <w:szCs w:val="18"/>
-                <w:lang w:val="en-US"/>
-              </w:rPr>
-              <w:t>Cambios</w:t>
-            </w:r>
-            <w:proofErr w:type="spellEnd"/>
+              <w:t>Descripción y Justificación de Cambios</w:t>
+            </w:r>
           </w:p>
         </w:tc>
       </w:tr>
@@ -8967,7 +8321,6 @@
             <w:vAlign w:val="center"/>
           </w:tcPr>
           <w:p>
-            <w:proofErr w:type="spellStart"/>
             <w:r>
               <w:rPr>
                 <w:color w:val="1A1A1A"/>
@@ -8975,57 +8328,7 @@
                 <w:szCs w:val="20"/>
                 <w:lang w:val="en-US"/>
               </w:rPr>
-              <w:t>Versión</w:t>
-            </w:r>
-            <w:proofErr w:type="spellEnd"/>
-            <w:r>
-              <w:rPr>
-                <w:color w:val="1A1A1A"/>
-                <w:sz w:val="20"/>
-                <w:szCs w:val="20"/>
-                <w:lang w:val="en-US"/>
-              </w:rPr>
-              <w:t xml:space="preserve"> </w:t>
-            </w:r>
-            <w:proofErr w:type="spellStart"/>
-            <w:r>
-              <w:rPr>
-                <w:color w:val="1A1A1A"/>
-                <w:sz w:val="20"/>
-                <w:szCs w:val="20"/>
-                <w:lang w:val="en-US"/>
-              </w:rPr>
-              <w:t>inicial</w:t>
-            </w:r>
-            <w:proofErr w:type="spellEnd"/>
-            <w:r>
-              <w:rPr>
-                <w:color w:val="1A1A1A"/>
-                <w:sz w:val="20"/>
-                <w:szCs w:val="20"/>
-                <w:lang w:val="en-US"/>
-              </w:rPr>
-              <w:t xml:space="preserve"> del </w:t>
-            </w:r>
-            <w:proofErr w:type="spellStart"/>
-            <w:r>
-              <w:rPr>
-                <w:color w:val="1A1A1A"/>
-                <w:sz w:val="20"/>
-                <w:szCs w:val="20"/>
-                <w:lang w:val="en-US"/>
-              </w:rPr>
-              <w:t>documento</w:t>
-            </w:r>
-            <w:proofErr w:type="spellEnd"/>
-            <w:r>
-              <w:rPr>
-                <w:color w:val="1A1A1A"/>
-                <w:sz w:val="20"/>
-                <w:szCs w:val="20"/>
-                <w:lang w:val="en-US"/>
-              </w:rPr>
-              <w:t>.</w:t>
+              <w:t>Versión inicial del documento.</w:t>
             </w:r>
           </w:p>
         </w:tc>
@@ -9797,6 +9100,7 @@
   <w:style w:type="character" w:default="1" w:styleId="Fuentedeprrafopredeter">
     <w:name w:val="Default Paragraph Font"/>
     <w:uiPriority w:val="1"/>
+    <w:semiHidden/>
     <w:unhideWhenUsed/>
   </w:style>
   <w:style w:type="table" w:default="1" w:styleId="Tablanormal">
@@ -10306,9 +9610,12 @@
 </file>
 
 <file path=customXml/item1.xml><?xml version="1.0" encoding="utf-8"?>
-<go:gDocsCustomXmlDataStorage xmlns:go="http://customooxmlschemas.google.com/" xmlns:r="http://schemas.openxmlformats.org/officeDocument/2006/relationships" uri="GoogleDocsCustomDataVersion2">
-  <go:docsCustomData xmlns:go="http://customooxmlschemas.google.com/" roundtripDataSignature="AMtx7mjtEGxBuoPmVpJaMSOuw1TLIxq6mQ==">CgMxLjA4AHIhMUZvRXV1d25Yd002YkVaclVlRHFtdHdrLTEwdFVVMFkw</go:docsCustomData>
-</go:gDocsCustomXmlDataStorage>
+<?mso-contentType ?>
+<FormTemplates xmlns="http://schemas.microsoft.com/sharepoint/v3/contenttype/forms">
+  <Display>DocumentLibraryForm</Display>
+  <Edit>DocumentLibraryForm</Edit>
+  <New>DocumentLibraryForm</New>
+</FormTemplates>
 </file>
 
 <file path=customXml/item2.xml><?xml version="1.0" encoding="utf-8"?>
@@ -10318,12 +9625,9 @@
 </file>
 
 <file path=customXml/item3.xml><?xml version="1.0" encoding="utf-8"?>
-<?mso-contentType ?>
-<FormTemplates xmlns="http://schemas.microsoft.com/sharepoint/v3/contenttype/forms">
-  <Display>DocumentLibraryForm</Display>
-  <Edit>DocumentLibraryForm</Edit>
-  <New>DocumentLibraryForm</New>
-</FormTemplates>
+<go:gDocsCustomXmlDataStorage xmlns:go="http://customooxmlschemas.google.com/" xmlns:r="http://schemas.openxmlformats.org/officeDocument/2006/relationships" uri="GoogleDocsCustomDataVersion2">
+  <go:docsCustomData xmlns:go="http://customooxmlschemas.google.com/" roundtripDataSignature="AMtx7mjtEGxBuoPmVpJaMSOuw1TLIxq6mQ==">CgMxLjA4AHIhMUZvRXV1d25Yd002YkVaclVlRHFtdHdrLTEwdFVVMFkw</go:docsCustomData>
+</go:gDocsCustomXmlDataStorage>
 </file>
 
 <file path=customXml/item4.xml><?xml version="1.0" encoding="utf-8"?>
@@ -10465,10 +9769,9 @@
 </file>
 
 <file path=customXml/itemProps1.xml><?xml version="1.0" encoding="utf-8"?>
-<ds:datastoreItem xmlns:ds="http://schemas.openxmlformats.org/officeDocument/2006/customXml" ds:itemID="{11111111-1234-1234-1234-123412341234}">
+<ds:datastoreItem xmlns:ds="http://schemas.openxmlformats.org/officeDocument/2006/customXml" ds:itemID="{F5FEE064-F001-4A19-93A2-D82A57462B81}">
   <ds:schemaRefs>
-    <ds:schemaRef ds:uri="http://customooxmlschemas.google.com/"/>
-    <ds:schemaRef ds:uri="http://schemas.openxmlformats.org/officeDocument/2006/relationships"/>
+    <ds:schemaRef ds:uri="http://schemas.microsoft.com/sharepoint/v3/contenttype/forms"/>
   </ds:schemaRefs>
 </ds:datastoreItem>
 </file>
@@ -10483,9 +9786,10 @@
 </file>
 
 <file path=customXml/itemProps3.xml><?xml version="1.0" encoding="utf-8"?>
-<ds:datastoreItem xmlns:ds="http://schemas.openxmlformats.org/officeDocument/2006/customXml" ds:itemID="{F5FEE064-F001-4A19-93A2-D82A57462B81}">
+<ds:datastoreItem xmlns:ds="http://schemas.openxmlformats.org/officeDocument/2006/customXml" ds:itemID="{11111111-1234-1234-1234-123412341234}">
   <ds:schemaRefs>
-    <ds:schemaRef ds:uri="http://schemas.microsoft.com/sharepoint/v3/contenttype/forms"/>
+    <ds:schemaRef ds:uri="http://customooxmlschemas.google.com/"/>
+    <ds:schemaRef ds:uri="http://schemas.openxmlformats.org/officeDocument/2006/relationships"/>
   </ds:schemaRefs>
 </ds:datastoreItem>
 </file>

</xml_diff>